<commit_message>
Add system architecture diagram PNG and embed in technical report
</commit_message>
<xml_diff>
--- a/reports/PakSentinel_Technical_Report.docx
+++ b/reports/PakSentinel_Technical_Report.docx
@@ -28,7 +28,7 @@
         </w:p>
       </w:sdtContent>
     </w:sdt>
-    <w:bookmarkStart w:id="89" w:name="X4308f4079ec7aaba67b98dc7a58fd8690c7ff45"/>
+    <w:bookmarkStart w:id="90" w:name="X4308f4079ec7aaba67b98dc7a58fd8690c7ff45"/>
     <w:p>
       <w:pPr>
         <w:pStyle w:val="Heading1"/>
@@ -8165,7 +8165,7 @@
     </w:p>
     <w:bookmarkEnd w:id="80"/>
     <w:bookmarkEnd w:id="81"/>
-    <w:bookmarkStart w:id="86" w:name="task-7-fastapi-inference-system-30-marks"/>
+    <w:bookmarkStart w:id="87" w:name="task-7-fastapi-inference-system-30-marks"/>
     <w:p>
       <w:pPr>
         <w:pStyle w:val="Heading2"/>
@@ -8174,7 +8174,7 @@
         <w:t xml:space="preserve">8. Task 7 — FastAPI Inference System [30 Marks]</w:t>
       </w:r>
     </w:p>
-    <w:bookmarkStart w:id="82" w:name="system-architecture"/>
+    <w:bookmarkStart w:id="83" w:name="system-architecture"/>
     <w:p>
       <w:pPr>
         <w:pStyle w:val="Heading3"/>
@@ -8185,6 +8185,61 @@
     </w:p>
     <w:p>
       <w:pPr>
+        <w:pStyle w:val="CaptionedFigure"/>
+      </w:pPr>
+      <w:r>
+        <w:drawing>
+          <wp:inline>
+            <wp:extent cx="5334000" cy="5720027"/>
+            <wp:effectExtent b="0" l="0" r="0" t="0"/>
+            <wp:docPr descr="PakSentinel FastAPI System Architecture" title="" id="1" name="Picture"/>
+            <a:graphic>
+              <a:graphicData uri="http://schemas.openxmlformats.org/drawingml/2006/picture">
+                <pic:pic>
+                  <pic:nvPicPr>
+                    <pic:cNvPr descr="figures/system_architecture.png" id="0" name="Picture"/>
+                    <pic:cNvPicPr>
+                      <a:picLocks noChangeArrowheads="1" noChangeAspect="1"/>
+                    </pic:cNvPicPr>
+                  </pic:nvPicPr>
+                  <pic:blipFill>
+                    <a:blip r:embed="rId82"/>
+                    <a:stretch>
+                      <a:fillRect/>
+                    </a:stretch>
+                  </pic:blipFill>
+                  <pic:spPr bwMode="auto">
+                    <a:xfrm>
+                      <a:off x="0" y="0"/>
+                      <a:ext cx="5334000" cy="5720027"/>
+                    </a:xfrm>
+                    <a:prstGeom prst="rect">
+                      <a:avLst/>
+                    </a:prstGeom>
+                    <a:noFill/>
+                    <a:ln w="9525">
+                      <a:noFill/>
+                      <a:headEnd/>
+                      <a:tailEnd/>
+                    </a:ln>
+                  </pic:spPr>
+                </pic:pic>
+              </a:graphicData>
+            </a:graphic>
+          </wp:inline>
+        </w:drawing>
+      </w:r>
+    </w:p>
+    <w:p>
+      <w:pPr>
+        <w:pStyle w:val="ImageCaption"/>
+      </w:pPr>
+      <w:r>
+        <w:t xml:space="preserve">PakSentinel FastAPI System Architecture</w:t>
+      </w:r>
+    </w:p>
+    <w:p>
+      <w:pPr>
         <w:pStyle w:val="SourceCode"/>
       </w:pPr>
       <w:r>
@@ -8500,8 +8555,8 @@
         <w:t xml:space="preserve">└─────────────────────────────────────────────────────┘</w:t>
       </w:r>
     </w:p>
-    <w:bookmarkEnd w:id="82"/>
-    <w:bookmarkStart w:id="83" w:name="endpoints"/>
+    <w:bookmarkEnd w:id="83"/>
+    <w:bookmarkStart w:id="84" w:name="endpoints"/>
     <w:p>
       <w:pPr>
         <w:pStyle w:val="Heading3"/>
@@ -8863,8 +8918,8 @@
         </w:tc>
       </w:tr>
     </w:tbl>
-    <w:bookmarkEnd w:id="83"/>
-    <w:bookmarkStart w:id="84" w:name="pydantic-validation"/>
+    <w:bookmarkEnd w:id="84"/>
+    <w:bookmarkStart w:id="85" w:name="pydantic-validation"/>
     <w:p>
       <w:pPr>
         <w:pStyle w:val="Heading3"/>
@@ -8909,8 +8964,8 @@
         <w:t xml:space="preserve">Batch: 1–100 texts, each individually validated</w:t>
       </w:r>
     </w:p>
-    <w:bookmarkEnd w:id="84"/>
-    <w:bookmarkStart w:id="85" w:name="test-results"/>
+    <w:bookmarkEnd w:id="85"/>
+    <w:bookmarkStart w:id="86" w:name="test-results"/>
     <w:p>
       <w:pPr>
         <w:pStyle w:val="Heading3"/>
@@ -9009,9 +9064,9 @@
         </w:pict>
       </w:r>
     </w:p>
-    <w:bookmarkEnd w:id="85"/>
     <w:bookmarkEnd w:id="86"/>
-    <w:bookmarkStart w:id="87" w:name="conclusion"/>
+    <w:bookmarkEnd w:id="87"/>
+    <w:bookmarkStart w:id="88" w:name="conclusion"/>
     <w:p>
       <w:pPr>
         <w:pStyle w:val="Heading2"/>
@@ -9189,8 +9244,8 @@
         </w:pict>
       </w:r>
     </w:p>
-    <w:bookmarkEnd w:id="87"/>
-    <w:bookmarkStart w:id="88" w:name="references"/>
+    <w:bookmarkEnd w:id="88"/>
+    <w:bookmarkStart w:id="89" w:name="references"/>
     <w:p>
       <w:pPr>
         <w:pStyle w:val="Heading2"/>
@@ -9643,8 +9698,8 @@
         <w:t xml:space="preserve">ACL.</w:t>
       </w:r>
     </w:p>
-    <w:bookmarkEnd w:id="88"/>
     <w:bookmarkEnd w:id="89"/>
+    <w:bookmarkEnd w:id="90"/>
     <w:sectPr/>
   </w:body>
 </w:document>

</xml_diff>